<commit_message>
nmv 01 -7 2025
</commit_message>
<xml_diff>
--- a/TS-Kramam/TS-2.2/TS 2.2 Malayalam Krama Paatam Corrections.docx
+++ b/TS-Kramam/TS-2.2/TS 2.2 Malayalam Krama Paatam Corrections.docx
@@ -2194,6 +2194,786 @@
       </w:tr>
       <w:tr>
         <w:trPr>
+          <w:trHeight w:val="699"/>
+        </w:trPr>
+        <w:tc>
+          <w:tcPr>
+            <w:tcW w:w="3573" w:type="dxa"/>
+          </w:tcPr>
+          <w:p>
+            <w:pPr>
+              <w:widowControl w:val="0"/>
+              <w:autoSpaceDE w:val="0"/>
+              <w:autoSpaceDN w:val="0"/>
+              <w:adjustRightInd w:val="0"/>
+              <w:spacing w:before="0" w:line="240" w:lineRule="auto"/>
+              <w:rPr>
+                <w:rFonts w:cs="Arial"/>
+                <w:b/>
+                <w:sz w:val="28"/>
+                <w:szCs w:val="28"/>
+                <w:lang w:val="it-IT"/>
+              </w:rPr>
+            </w:pPr>
+          </w:p>
+          <w:p>
+            <w:pPr>
+              <w:widowControl w:val="0"/>
+              <w:autoSpaceDE w:val="0"/>
+              <w:autoSpaceDN w:val="0"/>
+              <w:adjustRightInd w:val="0"/>
+              <w:spacing w:before="0" w:line="240" w:lineRule="auto"/>
+              <w:rPr>
+                <w:rFonts w:cs="Arial"/>
+                <w:b/>
+                <w:sz w:val="28"/>
+                <w:szCs w:val="28"/>
+                <w:lang w:val="it-IT"/>
+              </w:rPr>
+            </w:pPr>
+          </w:p>
+          <w:p>
+            <w:pPr>
+              <w:widowControl w:val="0"/>
+              <w:autoSpaceDE w:val="0"/>
+              <w:autoSpaceDN w:val="0"/>
+              <w:adjustRightInd w:val="0"/>
+              <w:spacing w:before="0" w:line="240" w:lineRule="auto"/>
+              <w:rPr>
+                <w:rFonts w:cs="Arial"/>
+                <w:b/>
+                <w:sz w:val="28"/>
+                <w:szCs w:val="28"/>
+                <w:lang w:val="it-IT"/>
+              </w:rPr>
+            </w:pPr>
+          </w:p>
+          <w:p>
+            <w:pPr>
+              <w:widowControl w:val="0"/>
+              <w:autoSpaceDE w:val="0"/>
+              <w:autoSpaceDN w:val="0"/>
+              <w:adjustRightInd w:val="0"/>
+              <w:spacing w:before="0" w:line="240" w:lineRule="auto"/>
+              <w:rPr>
+                <w:rFonts w:cs="Arial"/>
+                <w:b/>
+                <w:sz w:val="28"/>
+                <w:szCs w:val="28"/>
+                <w:lang w:val="it-IT"/>
+              </w:rPr>
+            </w:pPr>
+          </w:p>
+          <w:p>
+            <w:pPr>
+              <w:widowControl w:val="0"/>
+              <w:autoSpaceDE w:val="0"/>
+              <w:autoSpaceDN w:val="0"/>
+              <w:adjustRightInd w:val="0"/>
+              <w:spacing w:before="0" w:line="240" w:lineRule="auto"/>
+              <w:rPr>
+                <w:rFonts w:cs="Arial"/>
+                <w:b/>
+                <w:sz w:val="28"/>
+                <w:szCs w:val="28"/>
+                <w:lang w:val="it-IT"/>
+              </w:rPr>
+            </w:pPr>
+          </w:p>
+          <w:p>
+            <w:pPr>
+              <w:widowControl w:val="0"/>
+              <w:autoSpaceDE w:val="0"/>
+              <w:autoSpaceDN w:val="0"/>
+              <w:adjustRightInd w:val="0"/>
+              <w:spacing w:before="0" w:line="240" w:lineRule="auto"/>
+              <w:rPr>
+                <w:rFonts w:cs="Arial"/>
+                <w:b/>
+                <w:sz w:val="28"/>
+                <w:szCs w:val="28"/>
+                <w:lang w:val="it-IT"/>
+              </w:rPr>
+            </w:pPr>
+            <w:r>
+              <w:rPr>
+                <w:rFonts w:cs="Arial"/>
+                <w:b/>
+                <w:sz w:val="28"/>
+                <w:szCs w:val="28"/>
+                <w:lang w:val="it-IT"/>
+              </w:rPr>
+              <w:lastRenderedPageBreak/>
+              <w:t>TS 2.2.</w:t>
+            </w:r>
+            <w:r>
+              <w:rPr>
+                <w:rFonts w:cs="Arial"/>
+                <w:b/>
+                <w:sz w:val="28"/>
+                <w:szCs w:val="28"/>
+                <w:lang w:val="it-IT"/>
+              </w:rPr>
+              <w:t>10.5</w:t>
+            </w:r>
+            <w:r>
+              <w:rPr>
+                <w:rFonts w:cs="Arial"/>
+                <w:b/>
+                <w:sz w:val="28"/>
+                <w:szCs w:val="28"/>
+                <w:lang w:val="it-IT"/>
+              </w:rPr>
+              <w:t xml:space="preserve"> - Kramam</w:t>
+            </w:r>
+          </w:p>
+          <w:p>
+            <w:pPr>
+              <w:widowControl w:val="0"/>
+              <w:autoSpaceDE w:val="0"/>
+              <w:autoSpaceDN w:val="0"/>
+              <w:adjustRightInd w:val="0"/>
+              <w:spacing w:before="0" w:line="240" w:lineRule="auto"/>
+              <w:rPr>
+                <w:rFonts w:cs="Arial"/>
+                <w:b/>
+                <w:sz w:val="28"/>
+                <w:szCs w:val="28"/>
+                <w:lang w:val="it-IT"/>
+              </w:rPr>
+            </w:pPr>
+            <w:r>
+              <w:rPr>
+                <w:rFonts w:cs="Arial"/>
+                <w:b/>
+                <w:sz w:val="28"/>
+                <w:szCs w:val="28"/>
+                <w:lang w:val="it-IT"/>
+              </w:rPr>
+              <w:t xml:space="preserve">Krama Vaakyam No. - </w:t>
+            </w:r>
+            <w:r>
+              <w:rPr>
+                <w:rFonts w:cs="Arial"/>
+                <w:b/>
+                <w:sz w:val="28"/>
+                <w:szCs w:val="28"/>
+                <w:lang w:val="it-IT"/>
+              </w:rPr>
+              <w:t>33</w:t>
+            </w:r>
+            <w:r>
+              <w:rPr>
+                <w:rFonts w:cs="Arial"/>
+                <w:b/>
+                <w:sz w:val="28"/>
+                <w:szCs w:val="28"/>
+                <w:lang w:val="it-IT"/>
+              </w:rPr>
+              <w:br/>
+              <w:t xml:space="preserve">Panchaati No. - </w:t>
+            </w:r>
+            <w:r>
+              <w:rPr>
+                <w:rFonts w:cs="Arial"/>
+                <w:b/>
+                <w:sz w:val="28"/>
+                <w:szCs w:val="28"/>
+                <w:lang w:val="it-IT"/>
+              </w:rPr>
+              <w:t>57</w:t>
+            </w:r>
+          </w:p>
+        </w:tc>
+        <w:tc>
+          <w:tcPr>
+            <w:tcW w:w="4961" w:type="dxa"/>
+          </w:tcPr>
+          <w:p>
+            <w:pPr>
+              <w:widowControl w:val="0"/>
+              <w:autoSpaceDE w:val="0"/>
+              <w:autoSpaceDN w:val="0"/>
+              <w:adjustRightInd w:val="0"/>
+              <w:spacing w:before="0" w:line="240" w:lineRule="auto"/>
+              <w:rPr>
+                <w:rFonts w:ascii="BRH Malayalam Extra" w:hAnsi="BRH Malayalam Extra" w:cs="BRH Malayalam Extra"/>
+                <w:color w:val="000000"/>
+                <w:sz w:val="40"/>
+                <w:szCs w:val="40"/>
+                <w:lang w:val="it-IT"/>
+              </w:rPr>
+            </w:pPr>
+          </w:p>
+          <w:p>
+            <w:pPr>
+              <w:widowControl w:val="0"/>
+              <w:autoSpaceDE w:val="0"/>
+              <w:autoSpaceDN w:val="0"/>
+              <w:adjustRightInd w:val="0"/>
+              <w:spacing w:before="0" w:line="240" w:lineRule="auto"/>
+              <w:rPr>
+                <w:rFonts w:ascii="BRH Malayalam Extra" w:hAnsi="BRH Malayalam Extra" w:cs="BRH Malayalam Extra"/>
+                <w:color w:val="000000"/>
+                <w:sz w:val="40"/>
+                <w:szCs w:val="40"/>
+                <w:lang w:val="it-IT"/>
+              </w:rPr>
+            </w:pPr>
+          </w:p>
+          <w:p>
+            <w:pPr>
+              <w:widowControl w:val="0"/>
+              <w:autoSpaceDE w:val="0"/>
+              <w:autoSpaceDN w:val="0"/>
+              <w:adjustRightInd w:val="0"/>
+              <w:spacing w:before="0" w:line="240" w:lineRule="auto"/>
+              <w:rPr>
+                <w:rFonts w:ascii="BRH Malayalam Extra" w:hAnsi="BRH Malayalam Extra" w:cs="BRH Malayalam Extra"/>
+                <w:color w:val="000000"/>
+                <w:sz w:val="40"/>
+                <w:szCs w:val="40"/>
+                <w:lang w:val="it-IT"/>
+              </w:rPr>
+            </w:pPr>
+            <w:r>
+              <w:rPr>
+                <w:rFonts w:ascii="BRH Malayalam Extra" w:hAnsi="BRH Malayalam Extra" w:cs="BRH Malayalam Extra"/>
+                <w:color w:val="000000"/>
+                <w:sz w:val="40"/>
+                <w:szCs w:val="40"/>
+                <w:lang w:val="it-IT"/>
+              </w:rPr>
+              <w:lastRenderedPageBreak/>
+              <w:t>¥sx</w:t>
+            </w:r>
+            <w:r>
+              <w:rPr>
+                <w:rFonts w:ascii="BRH Malayalam Extra" w:hAnsi="BRH Malayalam Extra" w:cs="BRH Malayalam Extra"/>
+                <w:b/>
+                <w:color w:val="000000"/>
+                <w:sz w:val="32"/>
+                <w:szCs w:val="40"/>
+                <w:lang w:val="it-IT"/>
+              </w:rPr>
+              <w:t>–</w:t>
+            </w:r>
+            <w:r>
+              <w:rPr>
+                <w:rFonts w:ascii="BRH Malayalam Extra" w:hAnsi="BRH Malayalam Extra" w:cs="BRH Malayalam Extra"/>
+                <w:color w:val="000000"/>
+                <w:sz w:val="40"/>
+                <w:szCs w:val="40"/>
+                <w:lang w:val="it-IT"/>
+              </w:rPr>
+              <w:t>ix</w:t>
+            </w:r>
+            <w:r>
+              <w:rPr>
+                <w:rFonts w:ascii="BRH Malayalam Extra" w:hAnsi="BRH Malayalam Extra" w:cs="BRH Malayalam Extra"/>
+                <w:b/>
+                <w:color w:val="000000"/>
+                <w:sz w:val="32"/>
+                <w:szCs w:val="40"/>
+                <w:lang w:val="it-IT"/>
+              </w:rPr>
+              <w:t>–</w:t>
+            </w:r>
+            <w:r>
+              <w:rPr>
+                <w:rFonts w:ascii="BRH Malayalam Extra" w:hAnsi="BRH Malayalam Extra" w:cs="BRH Malayalam Extra"/>
+                <w:color w:val="000000"/>
+                <w:sz w:val="40"/>
+                <w:szCs w:val="40"/>
+                <w:lang w:val="it-IT"/>
+              </w:rPr>
+              <w:t>k¦</w:t>
+            </w:r>
+            <w:r>
+              <w:rPr>
+                <w:rFonts w:ascii="BRH Malayalam Extra" w:hAnsi="BRH Malayalam Extra" w:cs="BRH Malayalam Extra"/>
+                <w:b/>
+                <w:color w:val="000000"/>
+                <w:sz w:val="32"/>
+                <w:szCs w:val="40"/>
+                <w:lang w:val="it-IT"/>
+              </w:rPr>
+              <w:t>–</w:t>
+            </w:r>
+            <w:r>
+              <w:rPr>
+                <w:rFonts w:ascii="BRH Malayalam Extra" w:hAnsi="BRH Malayalam Extra" w:cs="BRH Malayalam Extra"/>
+                <w:color w:val="000000"/>
+                <w:sz w:val="40"/>
+                <w:szCs w:val="40"/>
+                <w:lang w:val="it-IT"/>
+              </w:rPr>
+              <w:t>öbI P</w:t>
+            </w:r>
+            <w:r>
+              <w:rPr>
+                <w:rFonts w:ascii="BRH Malayalam Extra" w:hAnsi="BRH Malayalam Extra" w:cs="BRH Malayalam Extra"/>
+                <w:b/>
+                <w:color w:val="000000"/>
+                <w:sz w:val="32"/>
+                <w:szCs w:val="40"/>
+                <w:lang w:val="it-IT"/>
+              </w:rPr>
+              <w:t>–</w:t>
+            </w:r>
+            <w:r>
+              <w:rPr>
+                <w:rFonts w:ascii="BRH Malayalam Extra" w:hAnsi="BRH Malayalam Extra" w:cs="BRH Malayalam Extra"/>
+                <w:color w:val="000000"/>
+                <w:sz w:val="40"/>
+                <w:szCs w:val="40"/>
+                <w:lang w:val="it-IT"/>
+              </w:rPr>
+              <w:t xml:space="preserve">k¡I | </w:t>
+            </w:r>
+          </w:p>
+          <w:p>
+            <w:pPr>
+              <w:widowControl w:val="0"/>
+              <w:autoSpaceDE w:val="0"/>
+              <w:autoSpaceDN w:val="0"/>
+              <w:adjustRightInd w:val="0"/>
+              <w:spacing w:before="0" w:line="240" w:lineRule="auto"/>
+              <w:ind w:right="-279"/>
+              <w:rPr>
+                <w:rFonts w:ascii="BRH Malayalam Extra" w:hAnsi="BRH Malayalam Extra" w:cs="BRH Malayalam Extra"/>
+                <w:color w:val="000000"/>
+                <w:sz w:val="40"/>
+                <w:szCs w:val="40"/>
+                <w:lang w:val="it-IT"/>
+              </w:rPr>
+            </w:pPr>
+            <w:r>
+              <w:rPr>
+                <w:rFonts w:ascii="BRH Malayalam Extra" w:hAnsi="BRH Malayalam Extra" w:cs="BRH Malayalam Extra"/>
+                <w:color w:val="000000"/>
+                <w:sz w:val="40"/>
+                <w:szCs w:val="40"/>
+                <w:lang w:val="it-IT"/>
+              </w:rPr>
+              <w:t>¥sx</w:t>
+            </w:r>
+            <w:r>
+              <w:rPr>
+                <w:rFonts w:ascii="BRH Malayalam Extra" w:hAnsi="BRH Malayalam Extra" w:cs="BRH Malayalam Extra"/>
+                <w:b/>
+                <w:color w:val="000000"/>
+                <w:sz w:val="32"/>
+                <w:szCs w:val="40"/>
+                <w:highlight w:val="yellow"/>
+                <w:lang w:val="it-IT"/>
+              </w:rPr>
+              <w:t>–</w:t>
+            </w:r>
+            <w:r>
+              <w:rPr>
+                <w:rFonts w:ascii="BRH Malayalam Extra" w:hAnsi="BRH Malayalam Extra" w:cs="BRH Malayalam Extra"/>
+                <w:color w:val="000000"/>
+                <w:sz w:val="40"/>
+                <w:szCs w:val="40"/>
+                <w:highlight w:val="yellow"/>
+                <w:lang w:val="it-IT"/>
+              </w:rPr>
+              <w:t>i</w:t>
+            </w:r>
+            <w:r>
+              <w:rPr>
+                <w:rFonts w:ascii="BRH Malayalam Extra" w:hAnsi="BRH Malayalam Extra" w:cs="BRH Malayalam Extra"/>
+                <w:b/>
+                <w:color w:val="000000"/>
+                <w:sz w:val="32"/>
+                <w:szCs w:val="40"/>
+                <w:lang w:val="it-IT"/>
+              </w:rPr>
+              <w:t>–</w:t>
+            </w:r>
+            <w:r>
+              <w:rPr>
+                <w:rFonts w:ascii="BRH Malayalam Extra" w:hAnsi="BRH Malayalam Extra" w:cs="BRH Malayalam Extra"/>
+                <w:color w:val="000000"/>
+                <w:sz w:val="40"/>
+                <w:szCs w:val="40"/>
+                <w:lang w:val="it-IT"/>
+              </w:rPr>
+              <w:t>k¦</w:t>
+            </w:r>
+            <w:r>
+              <w:rPr>
+                <w:rFonts w:ascii="BRH Malayalam Extra" w:hAnsi="BRH Malayalam Extra" w:cs="BRH Malayalam Extra"/>
+                <w:b/>
+                <w:color w:val="000000"/>
+                <w:sz w:val="32"/>
+                <w:szCs w:val="40"/>
+                <w:lang w:val="it-IT"/>
+              </w:rPr>
+              <w:t>–</w:t>
+            </w:r>
+            <w:r>
+              <w:rPr>
+                <w:rFonts w:ascii="BRH Malayalam Extra" w:hAnsi="BRH Malayalam Extra" w:cs="BRH Malayalam Extra"/>
+                <w:color w:val="000000"/>
+                <w:sz w:val="40"/>
+                <w:szCs w:val="40"/>
+                <w:lang w:val="it-IT"/>
+              </w:rPr>
+              <w:t xml:space="preserve">öbiyZy— </w:t>
+            </w:r>
+          </w:p>
+          <w:p>
+            <w:pPr>
+              <w:widowControl w:val="0"/>
+              <w:autoSpaceDE w:val="0"/>
+              <w:autoSpaceDN w:val="0"/>
+              <w:adjustRightInd w:val="0"/>
+              <w:spacing w:before="0" w:line="240" w:lineRule="auto"/>
+              <w:ind w:right="-279"/>
+              <w:rPr>
+                <w:rFonts w:ascii="BRH Malayalam Extra" w:hAnsi="BRH Malayalam Extra" w:cs="BRH Malayalam Extra"/>
+                <w:color w:val="000000"/>
+                <w:sz w:val="40"/>
+                <w:szCs w:val="40"/>
+                <w:lang w:val="it-IT"/>
+              </w:rPr>
+            </w:pPr>
+            <w:r>
+              <w:rPr>
+                <w:rFonts w:ascii="BRH Malayalam Extra" w:hAnsi="BRH Malayalam Extra" w:cs="BRH Malayalam Extra"/>
+                <w:color w:val="000000"/>
+                <w:sz w:val="40"/>
+                <w:szCs w:val="40"/>
+                <w:lang w:val="it-IT"/>
+              </w:rPr>
+              <w:t>¥sxix - k¦</w:t>
+            </w:r>
+            <w:r>
+              <w:rPr>
+                <w:rFonts w:ascii="BRH Malayalam Extra" w:hAnsi="BRH Malayalam Extra" w:cs="BRH Malayalam Extra"/>
+                <w:b/>
+                <w:color w:val="000000"/>
+                <w:sz w:val="32"/>
+                <w:szCs w:val="40"/>
+                <w:lang w:val="it-IT"/>
+              </w:rPr>
+              <w:t>–</w:t>
+            </w:r>
+            <w:r>
+              <w:rPr>
+                <w:rFonts w:ascii="BRH Malayalam Extra" w:hAnsi="BRH Malayalam Extra" w:cs="BRH Malayalam Extra"/>
+                <w:color w:val="000000"/>
+                <w:sz w:val="40"/>
+                <w:szCs w:val="40"/>
+                <w:lang w:val="it-IT"/>
+              </w:rPr>
+              <w:t>öbI |</w:t>
+            </w:r>
+          </w:p>
+        </w:tc>
+        <w:tc>
+          <w:tcPr>
+            <w:tcW w:w="5245" w:type="dxa"/>
+          </w:tcPr>
+          <w:p>
+            <w:pPr>
+              <w:widowControl w:val="0"/>
+              <w:autoSpaceDE w:val="0"/>
+              <w:autoSpaceDN w:val="0"/>
+              <w:adjustRightInd w:val="0"/>
+              <w:spacing w:before="0" w:line="240" w:lineRule="auto"/>
+              <w:rPr>
+                <w:rFonts w:ascii="BRH Malayalam Extra" w:hAnsi="BRH Malayalam Extra" w:cs="BRH Malayalam Extra"/>
+                <w:color w:val="000000"/>
+                <w:sz w:val="40"/>
+                <w:szCs w:val="40"/>
+                <w:lang w:val="it-IT"/>
+              </w:rPr>
+            </w:pPr>
+          </w:p>
+          <w:p>
+            <w:pPr>
+              <w:widowControl w:val="0"/>
+              <w:autoSpaceDE w:val="0"/>
+              <w:autoSpaceDN w:val="0"/>
+              <w:adjustRightInd w:val="0"/>
+              <w:spacing w:before="0" w:line="240" w:lineRule="auto"/>
+              <w:rPr>
+                <w:rFonts w:ascii="BRH Malayalam Extra" w:hAnsi="BRH Malayalam Extra" w:cs="BRH Malayalam Extra"/>
+                <w:color w:val="000000"/>
+                <w:sz w:val="40"/>
+                <w:szCs w:val="40"/>
+                <w:lang w:val="it-IT"/>
+              </w:rPr>
+            </w:pPr>
+          </w:p>
+          <w:p>
+            <w:pPr>
+              <w:widowControl w:val="0"/>
+              <w:autoSpaceDE w:val="0"/>
+              <w:autoSpaceDN w:val="0"/>
+              <w:adjustRightInd w:val="0"/>
+              <w:spacing w:before="0" w:line="240" w:lineRule="auto"/>
+              <w:rPr>
+                <w:rFonts w:ascii="BRH Malayalam Extra" w:hAnsi="BRH Malayalam Extra" w:cs="BRH Malayalam Extra"/>
+                <w:color w:val="000000"/>
+                <w:sz w:val="40"/>
+                <w:szCs w:val="40"/>
+                <w:lang w:val="it-IT"/>
+              </w:rPr>
+            </w:pPr>
+            <w:r>
+              <w:rPr>
+                <w:rFonts w:ascii="BRH Malayalam Extra" w:hAnsi="BRH Malayalam Extra" w:cs="BRH Malayalam Extra"/>
+                <w:color w:val="000000"/>
+                <w:sz w:val="40"/>
+                <w:szCs w:val="40"/>
+                <w:lang w:val="it-IT"/>
+              </w:rPr>
+              <w:lastRenderedPageBreak/>
+              <w:t>¥sx</w:t>
+            </w:r>
+            <w:r>
+              <w:rPr>
+                <w:rFonts w:ascii="BRH Malayalam Extra" w:hAnsi="BRH Malayalam Extra" w:cs="BRH Malayalam Extra"/>
+                <w:b/>
+                <w:color w:val="000000"/>
+                <w:sz w:val="32"/>
+                <w:szCs w:val="40"/>
+                <w:lang w:val="it-IT"/>
+              </w:rPr>
+              <w:t>–</w:t>
+            </w:r>
+            <w:r>
+              <w:rPr>
+                <w:rFonts w:ascii="BRH Malayalam Extra" w:hAnsi="BRH Malayalam Extra" w:cs="BRH Malayalam Extra"/>
+                <w:color w:val="000000"/>
+                <w:sz w:val="40"/>
+                <w:szCs w:val="40"/>
+                <w:lang w:val="it-IT"/>
+              </w:rPr>
+              <w:t>ix</w:t>
+            </w:r>
+            <w:r>
+              <w:rPr>
+                <w:rFonts w:ascii="BRH Malayalam Extra" w:hAnsi="BRH Malayalam Extra" w:cs="BRH Malayalam Extra"/>
+                <w:b/>
+                <w:color w:val="000000"/>
+                <w:sz w:val="32"/>
+                <w:szCs w:val="40"/>
+                <w:lang w:val="it-IT"/>
+              </w:rPr>
+              <w:t>–</w:t>
+            </w:r>
+            <w:r>
+              <w:rPr>
+                <w:rFonts w:ascii="BRH Malayalam Extra" w:hAnsi="BRH Malayalam Extra" w:cs="BRH Malayalam Extra"/>
+                <w:color w:val="000000"/>
+                <w:sz w:val="40"/>
+                <w:szCs w:val="40"/>
+                <w:lang w:val="it-IT"/>
+              </w:rPr>
+              <w:t>k¦</w:t>
+            </w:r>
+            <w:r>
+              <w:rPr>
+                <w:rFonts w:ascii="BRH Malayalam Extra" w:hAnsi="BRH Malayalam Extra" w:cs="BRH Malayalam Extra"/>
+                <w:b/>
+                <w:color w:val="000000"/>
+                <w:sz w:val="32"/>
+                <w:szCs w:val="40"/>
+                <w:lang w:val="it-IT"/>
+              </w:rPr>
+              <w:t>–</w:t>
+            </w:r>
+            <w:r>
+              <w:rPr>
+                <w:rFonts w:ascii="BRH Malayalam Extra" w:hAnsi="BRH Malayalam Extra" w:cs="BRH Malayalam Extra"/>
+                <w:color w:val="000000"/>
+                <w:sz w:val="40"/>
+                <w:szCs w:val="40"/>
+                <w:lang w:val="it-IT"/>
+              </w:rPr>
+              <w:t>öbI P</w:t>
+            </w:r>
+            <w:r>
+              <w:rPr>
+                <w:rFonts w:ascii="BRH Malayalam Extra" w:hAnsi="BRH Malayalam Extra" w:cs="BRH Malayalam Extra"/>
+                <w:b/>
+                <w:color w:val="000000"/>
+                <w:sz w:val="32"/>
+                <w:szCs w:val="40"/>
+                <w:lang w:val="it-IT"/>
+              </w:rPr>
+              <w:t>–</w:t>
+            </w:r>
+            <w:r>
+              <w:rPr>
+                <w:rFonts w:ascii="BRH Malayalam Extra" w:hAnsi="BRH Malayalam Extra" w:cs="BRH Malayalam Extra"/>
+                <w:color w:val="000000"/>
+                <w:sz w:val="40"/>
+                <w:szCs w:val="40"/>
+                <w:lang w:val="it-IT"/>
+              </w:rPr>
+              <w:t xml:space="preserve">k¡I | </w:t>
+            </w:r>
+          </w:p>
+          <w:p>
+            <w:pPr>
+              <w:widowControl w:val="0"/>
+              <w:autoSpaceDE w:val="0"/>
+              <w:autoSpaceDN w:val="0"/>
+              <w:adjustRightInd w:val="0"/>
+              <w:spacing w:before="0" w:line="240" w:lineRule="auto"/>
+              <w:ind w:right="-279"/>
+              <w:rPr>
+                <w:rFonts w:ascii="BRH Malayalam Extra" w:hAnsi="BRH Malayalam Extra" w:cs="BRH Malayalam Extra"/>
+                <w:color w:val="000000"/>
+                <w:sz w:val="40"/>
+                <w:szCs w:val="40"/>
+                <w:lang w:val="it-IT"/>
+              </w:rPr>
+            </w:pPr>
+            <w:r>
+              <w:rPr>
+                <w:rFonts w:ascii="BRH Malayalam Extra" w:hAnsi="BRH Malayalam Extra" w:cs="BRH Malayalam Extra"/>
+                <w:color w:val="000000"/>
+                <w:sz w:val="40"/>
+                <w:szCs w:val="40"/>
+                <w:lang w:val="it-IT"/>
+              </w:rPr>
+              <w:t>¥sx</w:t>
+            </w:r>
+            <w:r>
+              <w:rPr>
+                <w:rFonts w:ascii="BRH Malayalam Extra" w:hAnsi="BRH Malayalam Extra" w:cs="BRH Malayalam Extra"/>
+                <w:b/>
+                <w:color w:val="000000"/>
+                <w:sz w:val="32"/>
+                <w:szCs w:val="40"/>
+                <w:lang w:val="it-IT"/>
+              </w:rPr>
+              <w:t>–</w:t>
+            </w:r>
+            <w:r>
+              <w:rPr>
+                <w:rFonts w:ascii="BRH Malayalam Extra" w:hAnsi="BRH Malayalam Extra" w:cs="BRH Malayalam Extra"/>
+                <w:color w:val="000000"/>
+                <w:sz w:val="40"/>
+                <w:szCs w:val="40"/>
+                <w:lang w:val="it-IT"/>
+              </w:rPr>
+              <w:t>i</w:t>
+            </w:r>
+            <w:r>
+              <w:rPr>
+                <w:rFonts w:ascii="BRH Malayalam Extra" w:hAnsi="BRH Malayalam Extra" w:cs="BRH Malayalam Extra"/>
+                <w:b/>
+                <w:color w:val="000000"/>
+                <w:sz w:val="32"/>
+                <w:szCs w:val="40"/>
+                <w:highlight w:val="green"/>
+                <w:lang w:val="it-IT"/>
+              </w:rPr>
+              <w:t>–</w:t>
+            </w:r>
+            <w:r>
+              <w:rPr>
+                <w:rFonts w:ascii="BRH Malayalam Extra" w:hAnsi="BRH Malayalam Extra" w:cs="BRH Malayalam Extra"/>
+                <w:color w:val="000000"/>
+                <w:sz w:val="40"/>
+                <w:szCs w:val="40"/>
+                <w:highlight w:val="green"/>
+                <w:lang w:val="it-IT"/>
+              </w:rPr>
+              <w:t>x</w:t>
+            </w:r>
+            <w:r>
+              <w:rPr>
+                <w:rFonts w:ascii="BRH Malayalam Extra" w:hAnsi="BRH Malayalam Extra" w:cs="BRH Malayalam Extra"/>
+                <w:color w:val="000000"/>
+                <w:sz w:val="40"/>
+                <w:szCs w:val="40"/>
+                <w:lang w:val="it-IT"/>
+              </w:rPr>
+              <w:t>k¦</w:t>
+            </w:r>
+            <w:r>
+              <w:rPr>
+                <w:rFonts w:ascii="BRH Malayalam Extra" w:hAnsi="BRH Malayalam Extra" w:cs="BRH Malayalam Extra"/>
+                <w:b/>
+                <w:color w:val="000000"/>
+                <w:sz w:val="32"/>
+                <w:szCs w:val="40"/>
+                <w:lang w:val="it-IT"/>
+              </w:rPr>
+              <w:t>–</w:t>
+            </w:r>
+            <w:r>
+              <w:rPr>
+                <w:rFonts w:ascii="BRH Malayalam Extra" w:hAnsi="BRH Malayalam Extra" w:cs="BRH Malayalam Extra"/>
+                <w:color w:val="000000"/>
+                <w:sz w:val="40"/>
+                <w:szCs w:val="40"/>
+                <w:lang w:val="it-IT"/>
+              </w:rPr>
+              <w:t xml:space="preserve">öbiyZy— </w:t>
+            </w:r>
+          </w:p>
+          <w:p>
+            <w:pPr>
+              <w:widowControl w:val="0"/>
+              <w:autoSpaceDE w:val="0"/>
+              <w:autoSpaceDN w:val="0"/>
+              <w:adjustRightInd w:val="0"/>
+              <w:spacing w:before="0" w:line="240" w:lineRule="auto"/>
+              <w:ind w:right="-279"/>
+              <w:rPr>
+                <w:rFonts w:ascii="BRH Malayalam Extra" w:hAnsi="BRH Malayalam Extra" w:cs="BRH Malayalam Extra"/>
+                <w:color w:val="000000"/>
+                <w:sz w:val="40"/>
+                <w:szCs w:val="40"/>
+                <w:lang w:val="it-IT"/>
+              </w:rPr>
+            </w:pPr>
+            <w:r>
+              <w:rPr>
+                <w:rFonts w:ascii="BRH Malayalam Extra" w:hAnsi="BRH Malayalam Extra" w:cs="BRH Malayalam Extra"/>
+                <w:color w:val="000000"/>
+                <w:sz w:val="40"/>
+                <w:szCs w:val="40"/>
+                <w:lang w:val="it-IT"/>
+              </w:rPr>
+              <w:t>¥sxix - k¦</w:t>
+            </w:r>
+            <w:r>
+              <w:rPr>
+                <w:rFonts w:ascii="BRH Malayalam Extra" w:hAnsi="BRH Malayalam Extra" w:cs="BRH Malayalam Extra"/>
+                <w:b/>
+                <w:color w:val="000000"/>
+                <w:sz w:val="32"/>
+                <w:szCs w:val="40"/>
+                <w:lang w:val="it-IT"/>
+              </w:rPr>
+              <w:t>–</w:t>
+            </w:r>
+            <w:r>
+              <w:rPr>
+                <w:rFonts w:ascii="BRH Malayalam Extra" w:hAnsi="BRH Malayalam Extra" w:cs="BRH Malayalam Extra"/>
+                <w:color w:val="000000"/>
+                <w:sz w:val="40"/>
+                <w:szCs w:val="40"/>
+                <w:lang w:val="it-IT"/>
+              </w:rPr>
+              <w:t>öbI |</w:t>
+            </w:r>
+          </w:p>
+        </w:tc>
+      </w:tr>
+      <w:tr>
+        <w:trPr>
           <w:trHeight w:val="1126"/>
         </w:trPr>
         <w:tc>
@@ -2223,6 +3003,7 @@
                 <w:szCs w:val="28"/>
                 <w:lang w:val="it-IT"/>
               </w:rPr>
+              <w:lastRenderedPageBreak/>
               <w:t>TS 2.2.12.1 - Kramam</w:t>
             </w:r>
           </w:p>
@@ -2514,7 +3295,6 @@
                 <w:szCs w:val="28"/>
                 <w:lang w:val="it-IT"/>
               </w:rPr>
-              <w:lastRenderedPageBreak/>
               <w:t>TS 2.2.12.1 - Kramam</w:t>
             </w:r>
           </w:p>
@@ -2850,15 +3630,16 @@
                 <w:color w:val="000000"/>
                 <w:sz w:val="40"/>
                 <w:szCs w:val="40"/>
-                <w:lang w:val="en-IN"/>
-              </w:rPr>
-            </w:pPr>
-            <w:r>
-              <w:rPr>
-                <w:rFonts w:ascii="BRH Malayalam Extra" w:hAnsi="BRH Malayalam Extra" w:cs="BRH Malayalam Extra"/>
-                <w:color w:val="000000"/>
-                <w:sz w:val="40"/>
-                <w:szCs w:val="40"/>
+                <w:lang w:val="it-IT"/>
+              </w:rPr>
+            </w:pPr>
+            <w:r>
+              <w:rPr>
+                <w:rFonts w:ascii="BRH Malayalam Extra" w:hAnsi="BRH Malayalam Extra" w:cs="BRH Malayalam Extra"/>
+                <w:color w:val="000000"/>
+                <w:sz w:val="40"/>
+                <w:szCs w:val="40"/>
+                <w:lang w:val="it-IT"/>
               </w:rPr>
               <w:t>sû</w:t>
             </w:r>
@@ -2869,15 +3650,17 @@
                 <w:color w:val="000000"/>
                 <w:sz w:val="32"/>
                 <w:szCs w:val="40"/>
-              </w:rPr>
-              <w:t>–</w:t>
-            </w:r>
-            <w:r>
-              <w:rPr>
-                <w:rFonts w:ascii="BRH Malayalam Extra" w:hAnsi="BRH Malayalam Extra" w:cs="BRH Malayalam Extra"/>
-                <w:color w:val="000000"/>
-                <w:sz w:val="40"/>
-                <w:szCs w:val="40"/>
+                <w:lang w:val="it-IT"/>
+              </w:rPr>
+              <w:t>–</w:t>
+            </w:r>
+            <w:r>
+              <w:rPr>
+                <w:rFonts w:ascii="BRH Malayalam Extra" w:hAnsi="BRH Malayalam Extra" w:cs="BRH Malayalam Extra"/>
+                <w:color w:val="000000"/>
+                <w:sz w:val="40"/>
+                <w:szCs w:val="40"/>
+                <w:lang w:val="it-IT"/>
               </w:rPr>
               <w:t>cx</w:t>
             </w:r>
@@ -2888,15 +3671,17 @@
                 <w:color w:val="000000"/>
                 <w:sz w:val="32"/>
                 <w:szCs w:val="40"/>
-              </w:rPr>
-              <w:t>–</w:t>
-            </w:r>
-            <w:r>
-              <w:rPr>
-                <w:rFonts w:ascii="BRH Malayalam Extra" w:hAnsi="BRH Malayalam Extra" w:cs="BRH Malayalam Extra"/>
-                <w:color w:val="000000"/>
-                <w:sz w:val="40"/>
-                <w:szCs w:val="40"/>
+                <w:lang w:val="it-IT"/>
+              </w:rPr>
+              <w:t>–</w:t>
+            </w:r>
+            <w:r>
+              <w:rPr>
+                <w:rFonts w:ascii="BRH Malayalam Extra" w:hAnsi="BRH Malayalam Extra" w:cs="BRH Malayalam Extra"/>
+                <w:color w:val="000000"/>
+                <w:sz w:val="40"/>
+                <w:szCs w:val="40"/>
+                <w:lang w:val="it-IT"/>
               </w:rPr>
               <w:t>p</w:t>
             </w:r>
@@ -2907,15 +3692,17 @@
                 <w:color w:val="000000"/>
                 <w:sz w:val="32"/>
                 <w:szCs w:val="40"/>
-              </w:rPr>
-              <w:t>–</w:t>
-            </w:r>
-            <w:r>
-              <w:rPr>
-                <w:rFonts w:ascii="BRH Malayalam Extra" w:hAnsi="BRH Malayalam Extra" w:cs="BRH Malayalam Extra"/>
-                <w:color w:val="000000"/>
-                <w:sz w:val="40"/>
-                <w:szCs w:val="40"/>
+                <w:lang w:val="it-IT"/>
+              </w:rPr>
+              <w:t>–</w:t>
+            </w:r>
+            <w:r>
+              <w:rPr>
+                <w:rFonts w:ascii="BRH Malayalam Extra" w:hAnsi="BRH Malayalam Extra" w:cs="BRH Malayalam Extra"/>
+                <w:color w:val="000000"/>
+                <w:sz w:val="40"/>
+                <w:szCs w:val="40"/>
+                <w:lang w:val="it-IT"/>
               </w:rPr>
               <w:t xml:space="preserve"> CZy— sû</w:t>
             </w:r>
@@ -2926,6 +3713,7 @@
                 <w:sz w:val="40"/>
                 <w:szCs w:val="40"/>
                 <w:highlight w:val="yellow"/>
+                <w:lang w:val="it-IT"/>
               </w:rPr>
               <w:t>cxpJ</w:t>
             </w:r>
@@ -2935,6 +3723,7 @@
                 <w:color w:val="000000"/>
                 <w:sz w:val="40"/>
                 <w:szCs w:val="40"/>
+                <w:lang w:val="it-IT"/>
               </w:rPr>
               <w:t xml:space="preserve"> ||</w:t>
             </w:r>
@@ -2957,14 +3746,16 @@
                 <w:color w:val="000000"/>
                 <w:sz w:val="40"/>
                 <w:szCs w:val="40"/>
-              </w:rPr>
-            </w:pPr>
-            <w:r>
-              <w:rPr>
-                <w:rFonts w:ascii="BRH Malayalam Extra" w:hAnsi="BRH Malayalam Extra" w:cs="BRH Malayalam Extra"/>
-                <w:color w:val="000000"/>
-                <w:sz w:val="40"/>
-                <w:szCs w:val="40"/>
+                <w:lang w:val="it-IT"/>
+              </w:rPr>
+            </w:pPr>
+            <w:r>
+              <w:rPr>
+                <w:rFonts w:ascii="BRH Malayalam Extra" w:hAnsi="BRH Malayalam Extra" w:cs="BRH Malayalam Extra"/>
+                <w:color w:val="000000"/>
+                <w:sz w:val="40"/>
+                <w:szCs w:val="40"/>
+                <w:lang w:val="it-IT"/>
               </w:rPr>
               <w:t>sû</w:t>
             </w:r>
@@ -2975,15 +3766,17 @@
                 <w:color w:val="000000"/>
                 <w:sz w:val="32"/>
                 <w:szCs w:val="40"/>
-              </w:rPr>
-              <w:t>–</w:t>
-            </w:r>
-            <w:r>
-              <w:rPr>
-                <w:rFonts w:ascii="BRH Malayalam Extra" w:hAnsi="BRH Malayalam Extra" w:cs="BRH Malayalam Extra"/>
-                <w:color w:val="000000"/>
-                <w:sz w:val="40"/>
-                <w:szCs w:val="40"/>
+                <w:lang w:val="it-IT"/>
+              </w:rPr>
+              <w:t>–</w:t>
+            </w:r>
+            <w:r>
+              <w:rPr>
+                <w:rFonts w:ascii="BRH Malayalam Extra" w:hAnsi="BRH Malayalam Extra" w:cs="BRH Malayalam Extra"/>
+                <w:color w:val="000000"/>
+                <w:sz w:val="40"/>
+                <w:szCs w:val="40"/>
+                <w:lang w:val="it-IT"/>
               </w:rPr>
               <w:t>cx</w:t>
             </w:r>
@@ -2994,15 +3787,17 @@
                 <w:color w:val="000000"/>
                 <w:sz w:val="32"/>
                 <w:szCs w:val="40"/>
-              </w:rPr>
-              <w:t>–</w:t>
-            </w:r>
-            <w:r>
-              <w:rPr>
-                <w:rFonts w:ascii="BRH Malayalam Extra" w:hAnsi="BRH Malayalam Extra" w:cs="BRH Malayalam Extra"/>
-                <w:color w:val="000000"/>
-                <w:sz w:val="40"/>
-                <w:szCs w:val="40"/>
+                <w:lang w:val="it-IT"/>
+              </w:rPr>
+              <w:t>–</w:t>
+            </w:r>
+            <w:r>
+              <w:rPr>
+                <w:rFonts w:ascii="BRH Malayalam Extra" w:hAnsi="BRH Malayalam Extra" w:cs="BRH Malayalam Extra"/>
+                <w:color w:val="000000"/>
+                <w:sz w:val="40"/>
+                <w:szCs w:val="40"/>
+                <w:lang w:val="it-IT"/>
               </w:rPr>
               <w:t>p</w:t>
             </w:r>
@@ -3013,15 +3808,17 @@
                 <w:color w:val="000000"/>
                 <w:sz w:val="32"/>
                 <w:szCs w:val="40"/>
-              </w:rPr>
-              <w:t>–</w:t>
-            </w:r>
-            <w:r>
-              <w:rPr>
-                <w:rFonts w:ascii="BRH Malayalam Extra" w:hAnsi="BRH Malayalam Extra" w:cs="BRH Malayalam Extra"/>
-                <w:color w:val="000000"/>
-                <w:sz w:val="40"/>
-                <w:szCs w:val="40"/>
+                <w:lang w:val="it-IT"/>
+              </w:rPr>
+              <w:t>–</w:t>
+            </w:r>
+            <w:r>
+              <w:rPr>
+                <w:rFonts w:ascii="BRH Malayalam Extra" w:hAnsi="BRH Malayalam Extra" w:cs="BRH Malayalam Extra"/>
+                <w:color w:val="000000"/>
+                <w:sz w:val="40"/>
+                <w:szCs w:val="40"/>
+                <w:lang w:val="it-IT"/>
               </w:rPr>
               <w:t xml:space="preserve"> CZy— sûcx </w:t>
             </w:r>
@@ -3032,6 +3829,7 @@
                 <w:sz w:val="40"/>
                 <w:szCs w:val="40"/>
                 <w:highlight w:val="green"/>
+                <w:lang w:val="it-IT"/>
               </w:rPr>
               <w:t>- p</w:t>
             </w:r>
@@ -3043,6 +3841,7 @@
                 <w:sz w:val="32"/>
                 <w:szCs w:val="40"/>
                 <w:highlight w:val="green"/>
+                <w:lang w:val="it-IT"/>
               </w:rPr>
               <w:t>–</w:t>
             </w:r>
@@ -3053,6 +3852,7 @@
                 <w:sz w:val="40"/>
                 <w:szCs w:val="40"/>
                 <w:highlight w:val="green"/>
+                <w:lang w:val="it-IT"/>
               </w:rPr>
               <w:t>J</w:t>
             </w:r>
@@ -3062,8 +3862,312 @@
                 <w:color w:val="000000"/>
                 <w:sz w:val="40"/>
                 <w:szCs w:val="40"/>
+                <w:lang w:val="it-IT"/>
               </w:rPr>
               <w:t xml:space="preserve"> ||</w:t>
+            </w:r>
+          </w:p>
+        </w:tc>
+      </w:tr>
+      <w:tr>
+        <w:trPr>
+          <w:trHeight w:val="1126"/>
+        </w:trPr>
+        <w:tc>
+          <w:tcPr>
+            <w:tcW w:w="3573" w:type="dxa"/>
+          </w:tcPr>
+          <w:p>
+            <w:pPr>
+              <w:widowControl w:val="0"/>
+              <w:autoSpaceDE w:val="0"/>
+              <w:autoSpaceDN w:val="0"/>
+              <w:adjustRightInd w:val="0"/>
+              <w:spacing w:before="0" w:line="240" w:lineRule="auto"/>
+              <w:rPr>
+                <w:rFonts w:cs="Arial"/>
+                <w:b/>
+                <w:sz w:val="28"/>
+                <w:szCs w:val="28"/>
+                <w:lang w:val="it-IT"/>
+              </w:rPr>
+            </w:pPr>
+            <w:r>
+              <w:rPr>
+                <w:rFonts w:cs="Arial"/>
+                <w:b/>
+                <w:sz w:val="28"/>
+                <w:szCs w:val="28"/>
+                <w:lang w:val="it-IT"/>
+              </w:rPr>
+              <w:t>TS 2.2.12.</w:t>
+            </w:r>
+            <w:r>
+              <w:rPr>
+                <w:rFonts w:cs="Arial"/>
+                <w:b/>
+                <w:sz w:val="28"/>
+                <w:szCs w:val="28"/>
+                <w:lang w:val="it-IT"/>
+              </w:rPr>
+              <w:t>7</w:t>
+            </w:r>
+            <w:r>
+              <w:rPr>
+                <w:rFonts w:cs="Arial"/>
+                <w:b/>
+                <w:sz w:val="28"/>
+                <w:szCs w:val="28"/>
+                <w:lang w:val="it-IT"/>
+              </w:rPr>
+              <w:t xml:space="preserve"> - Kramam</w:t>
+            </w:r>
+          </w:p>
+          <w:p>
+            <w:pPr>
+              <w:widowControl w:val="0"/>
+              <w:autoSpaceDE w:val="0"/>
+              <w:autoSpaceDN w:val="0"/>
+              <w:adjustRightInd w:val="0"/>
+              <w:spacing w:before="0" w:line="240" w:lineRule="auto"/>
+              <w:rPr>
+                <w:rFonts w:cs="Arial"/>
+                <w:b/>
+                <w:sz w:val="28"/>
+                <w:szCs w:val="28"/>
+                <w:lang w:val="it-IT"/>
+              </w:rPr>
+            </w:pPr>
+            <w:r>
+              <w:rPr>
+                <w:rFonts w:cs="Arial"/>
+                <w:b/>
+                <w:sz w:val="28"/>
+                <w:szCs w:val="28"/>
+                <w:lang w:val="it-IT"/>
+              </w:rPr>
+              <w:t xml:space="preserve">Krama Vaakyam No. - </w:t>
+            </w:r>
+            <w:r>
+              <w:rPr>
+                <w:rFonts w:cs="Arial"/>
+                <w:b/>
+                <w:sz w:val="28"/>
+                <w:szCs w:val="28"/>
+                <w:lang w:val="it-IT"/>
+              </w:rPr>
+              <w:t>56</w:t>
+            </w:r>
+            <w:r>
+              <w:rPr>
+                <w:rFonts w:cs="Arial"/>
+                <w:b/>
+                <w:sz w:val="28"/>
+                <w:szCs w:val="28"/>
+                <w:lang w:val="it-IT"/>
+              </w:rPr>
+              <w:br/>
+              <w:t xml:space="preserve">Panchaati No. - </w:t>
+            </w:r>
+            <w:r>
+              <w:rPr>
+                <w:rFonts w:cs="Arial"/>
+                <w:b/>
+                <w:sz w:val="28"/>
+                <w:szCs w:val="28"/>
+                <w:lang w:val="it-IT"/>
+              </w:rPr>
+              <w:t>70</w:t>
+            </w:r>
+          </w:p>
+        </w:tc>
+        <w:tc>
+          <w:tcPr>
+            <w:tcW w:w="4961" w:type="dxa"/>
+          </w:tcPr>
+          <w:p>
+            <w:pPr>
+              <w:widowControl w:val="0"/>
+              <w:autoSpaceDE w:val="0"/>
+              <w:autoSpaceDN w:val="0"/>
+              <w:adjustRightInd w:val="0"/>
+              <w:spacing w:line="252" w:lineRule="auto"/>
+              <w:rPr>
+                <w:rFonts w:ascii="BRH Malayalam Extra" w:hAnsi="BRH Malayalam Extra" w:cs="BRH Malayalam Extra"/>
+                <w:color w:val="000000"/>
+                <w:sz w:val="40"/>
+                <w:szCs w:val="40"/>
+                <w:lang w:val="it-IT"/>
+              </w:rPr>
+            </w:pPr>
+            <w:r>
+              <w:rPr>
+                <w:rFonts w:ascii="BRH Malayalam Extra" w:hAnsi="BRH Malayalam Extra" w:cs="BRH Malayalam Extra"/>
+                <w:color w:val="000000"/>
+                <w:sz w:val="40"/>
+                <w:szCs w:val="40"/>
+                <w:lang w:val="it-IT"/>
+              </w:rPr>
+              <w:t>öe jxhy—J |</w:t>
+            </w:r>
+            <w:r>
+              <w:rPr>
+                <w:rFonts w:ascii="BRH Malayalam Extra" w:hAnsi="BRH Malayalam Extra" w:cs="BRH Malayalam Extra"/>
+                <w:color w:val="000000"/>
+                <w:sz w:val="40"/>
+                <w:szCs w:val="40"/>
+                <w:lang w:val="it-IT"/>
+              </w:rPr>
+              <w:t xml:space="preserve"> </w:t>
+            </w:r>
+            <w:r>
+              <w:rPr>
+                <w:rFonts w:ascii="BRH Malayalam Extra" w:hAnsi="BRH Malayalam Extra" w:cs="BRH Malayalam Extra"/>
+                <w:color w:val="000000"/>
+                <w:sz w:val="40"/>
+                <w:szCs w:val="40"/>
+                <w:lang w:val="it-IT"/>
+              </w:rPr>
+              <w:t>jxhy</w:t>
+            </w:r>
+            <w:r>
+              <w:rPr>
+                <w:rFonts w:ascii="BRH Malayalam Extra" w:hAnsi="BRH Malayalam Extra" w:cs="BRH Malayalam Extra"/>
+                <w:b/>
+                <w:color w:val="000000"/>
+                <w:sz w:val="32"/>
+                <w:szCs w:val="40"/>
+                <w:highlight w:val="yellow"/>
+                <w:lang w:val="it-IT"/>
+              </w:rPr>
+              <w:t>–</w:t>
+            </w:r>
+            <w:r>
+              <w:rPr>
+                <w:rFonts w:ascii="BRH Malayalam Extra" w:hAnsi="BRH Malayalam Extra" w:cs="BRH Malayalam Extra"/>
+                <w:color w:val="000000"/>
+                <w:sz w:val="40"/>
+                <w:szCs w:val="40"/>
+                <w:highlight w:val="yellow"/>
+                <w:lang w:val="it-IT"/>
+              </w:rPr>
+              <w:t>ª</w:t>
+            </w:r>
+            <w:r>
+              <w:rPr>
+                <w:rFonts w:ascii="BRH Malayalam Extra" w:hAnsi="BRH Malayalam Extra" w:cs="BRH Malayalam Extra"/>
+                <w:b/>
+                <w:color w:val="000000"/>
+                <w:sz w:val="32"/>
+                <w:szCs w:val="40"/>
+                <w:highlight w:val="yellow"/>
+                <w:lang w:val="it-IT"/>
+              </w:rPr>
+              <w:t>–</w:t>
+            </w:r>
+            <w:r>
+              <w:rPr>
+                <w:rFonts w:ascii="BRH Malayalam Extra" w:hAnsi="BRH Malayalam Extra" w:cs="BRH Malayalam Extra"/>
+                <w:color w:val="000000"/>
+                <w:sz w:val="40"/>
+                <w:szCs w:val="40"/>
+                <w:highlight w:val="yellow"/>
+                <w:lang w:val="it-IT"/>
+              </w:rPr>
+              <w:t>.</w:t>
+            </w:r>
+            <w:r>
+              <w:rPr>
+                <w:rFonts w:ascii="BRH Malayalam Extra" w:hAnsi="BRH Malayalam Extra" w:cs="BRH Malayalam Extra"/>
+                <w:color w:val="000000"/>
+                <w:sz w:val="40"/>
+                <w:szCs w:val="40"/>
+                <w:lang w:val="it-IT"/>
+              </w:rPr>
+              <w:t xml:space="preserve"> jxsy— |</w:t>
+            </w:r>
+          </w:p>
+        </w:tc>
+        <w:tc>
+          <w:tcPr>
+            <w:tcW w:w="5245" w:type="dxa"/>
+          </w:tcPr>
+          <w:p>
+            <w:pPr>
+              <w:widowControl w:val="0"/>
+              <w:autoSpaceDE w:val="0"/>
+              <w:autoSpaceDN w:val="0"/>
+              <w:adjustRightInd w:val="0"/>
+              <w:spacing w:line="252" w:lineRule="auto"/>
+              <w:rPr>
+                <w:rFonts w:ascii="BRH Malayalam Extra" w:hAnsi="BRH Malayalam Extra" w:cs="BRH Malayalam Extra"/>
+                <w:color w:val="000000"/>
+                <w:sz w:val="40"/>
+                <w:szCs w:val="40"/>
+                <w:lang w:val="it-IT"/>
+              </w:rPr>
+            </w:pPr>
+            <w:r>
+              <w:rPr>
+                <w:rFonts w:ascii="BRH Malayalam Extra" w:hAnsi="BRH Malayalam Extra" w:cs="BRH Malayalam Extra"/>
+                <w:color w:val="000000"/>
+                <w:sz w:val="40"/>
+                <w:szCs w:val="40"/>
+                <w:lang w:val="it-IT"/>
+              </w:rPr>
+              <w:t>öe jxhy—J |</w:t>
+            </w:r>
+            <w:r>
+              <w:rPr>
+                <w:rFonts w:ascii="BRH Malayalam Extra" w:hAnsi="BRH Malayalam Extra" w:cs="BRH Malayalam Extra"/>
+                <w:color w:val="000000"/>
+                <w:sz w:val="40"/>
+                <w:szCs w:val="40"/>
+                <w:lang w:val="it-IT"/>
+              </w:rPr>
+              <w:t xml:space="preserve"> </w:t>
+            </w:r>
+            <w:r>
+              <w:rPr>
+                <w:rFonts w:ascii="BRH Malayalam Extra" w:hAnsi="BRH Malayalam Extra" w:cs="BRH Malayalam Extra"/>
+                <w:color w:val="000000"/>
+                <w:sz w:val="40"/>
+                <w:szCs w:val="40"/>
+                <w:lang w:val="it-IT"/>
+              </w:rPr>
+              <w:t>jxhy</w:t>
+            </w:r>
+            <w:r>
+              <w:rPr>
+                <w:rFonts w:ascii="BRH Malayalam Extra" w:hAnsi="BRH Malayalam Extra" w:cs="BRH Malayalam Extra"/>
+                <w:b/>
+                <w:color w:val="000000"/>
+                <w:sz w:val="32"/>
+                <w:szCs w:val="40"/>
+                <w:lang w:val="it-IT"/>
+              </w:rPr>
+              <w:t>–</w:t>
+            </w:r>
+            <w:r>
+              <w:rPr>
+                <w:rFonts w:ascii="BRH Malayalam Extra" w:hAnsi="BRH Malayalam Extra" w:cs="BRH Malayalam Extra"/>
+                <w:color w:val="000000"/>
+                <w:sz w:val="40"/>
+                <w:szCs w:val="40"/>
+                <w:highlight w:val="green"/>
+                <w:lang w:val="it-IT"/>
+              </w:rPr>
+              <w:t>ª</w:t>
+            </w:r>
+            <w:r>
+              <w:rPr>
+                <w:rFonts w:ascii="BRH Malayalam Extra" w:hAnsi="BRH Malayalam Extra" w:cs="BRH Malayalam Extra"/>
+                <w:color w:val="000000"/>
+                <w:sz w:val="40"/>
+                <w:szCs w:val="40"/>
+                <w:lang w:val="it-IT"/>
+              </w:rPr>
+              <w:t xml:space="preserve"> jxsy— |</w:t>
             </w:r>
           </w:p>
         </w:tc>
@@ -3078,6 +4182,7 @@
           <w:sz w:val="32"/>
           <w:szCs w:val="32"/>
           <w:u w:val="single"/>
+          <w:lang w:val="it-IT"/>
         </w:rPr>
       </w:pPr>
     </w:p>
@@ -3090,6 +4195,7 @@
           <w:sz w:val="32"/>
           <w:szCs w:val="32"/>
           <w:u w:val="single"/>
+          <w:lang w:val="it-IT"/>
         </w:rPr>
       </w:pPr>
     </w:p>
@@ -3102,6 +4208,7 @@
           <w:sz w:val="32"/>
           <w:szCs w:val="32"/>
           <w:u w:val="single"/>
+          <w:lang w:val="it-IT"/>
         </w:rPr>
       </w:pPr>
     </w:p>
@@ -3275,6 +4382,7 @@
                 <w:sz w:val="28"/>
                 <w:szCs w:val="28"/>
               </w:rPr>
+              <w:lastRenderedPageBreak/>
               <w:t>Section, Paragraph</w:t>
             </w:r>
           </w:p>
@@ -4149,7 +5257,6 @@
                 <w:szCs w:val="40"/>
                 <w:lang w:val="it-IT"/>
               </w:rPr>
-              <w:lastRenderedPageBreak/>
               <w:t>bûxb—qK</w:t>
             </w:r>
             <w:r>
@@ -4223,7 +5330,6 @@
                 <w:sz w:val="40"/>
                 <w:szCs w:val="40"/>
               </w:rPr>
-              <w:lastRenderedPageBreak/>
               <w:t xml:space="preserve">jb§ bûxb—qKexmJ | </w:t>
             </w:r>
           </w:p>
@@ -4245,7 +5351,6 @@
                 <w:sz w:val="40"/>
                 <w:szCs w:val="40"/>
               </w:rPr>
-              <w:lastRenderedPageBreak/>
               <w:t>bûxb—qK</w:t>
             </w:r>
             <w:r>
@@ -4326,7 +5431,6 @@
                 <w:szCs w:val="28"/>
                 <w:lang w:val="it-IT"/>
               </w:rPr>
-              <w:lastRenderedPageBreak/>
               <w:t>TS 2.2.6.2 - Kramam</w:t>
             </w:r>
           </w:p>
@@ -5368,6 +6472,7 @@
                 <w:szCs w:val="28"/>
                 <w:lang w:val="it-IT"/>
               </w:rPr>
+              <w:lastRenderedPageBreak/>
               <w:t>TS 2.2.7.4 - Kramam</w:t>
             </w:r>
           </w:p>
@@ -6432,7 +7537,6 @@
                 <w:szCs w:val="28"/>
                 <w:lang w:val="it-IT"/>
               </w:rPr>
-              <w:lastRenderedPageBreak/>
               <w:t>TS 2.2.8.6 - Kramam</w:t>
             </w:r>
           </w:p>
@@ -7306,6 +8410,7 @@
           <w:b/>
           <w:bCs/>
         </w:rPr>
+        <w:lastRenderedPageBreak/>
         <w:t>(ignore those which are already incorporated in your book’s version and date)</w:t>
       </w:r>
     </w:p>
@@ -8138,7 +9243,6 @@
                 <w:szCs w:val="28"/>
                 <w:lang w:val="it-IT"/>
               </w:rPr>
-              <w:lastRenderedPageBreak/>
               <w:t>TS 2.2.6.3 - Kramam</w:t>
             </w:r>
           </w:p>
@@ -10090,6 +11194,7 @@
           <w:szCs w:val="32"/>
           <w:u w:val="single"/>
         </w:rPr>
+        <w:lastRenderedPageBreak/>
         <w:t>===============</w:t>
       </w:r>
     </w:p>
@@ -10405,7 +11510,6 @@
                 <w:szCs w:val="28"/>
                 <w:lang w:val="it-IT"/>
               </w:rPr>
-              <w:lastRenderedPageBreak/>
               <w:t>TS 2.2.1.1</w:t>
             </w:r>
             <w:r>
@@ -12023,6 +13127,7 @@
                 <w:szCs w:val="28"/>
                 <w:lang w:val="it-IT"/>
               </w:rPr>
+              <w:lastRenderedPageBreak/>
               <w:t>TS 2.2.7.5</w:t>
             </w:r>
           </w:p>
@@ -12817,7 +13922,6 @@
                 <w:szCs w:val="28"/>
                 <w:lang w:val="it-IT"/>
               </w:rPr>
-              <w:lastRenderedPageBreak/>
               <w:t>TS 2.2.9.5</w:t>
             </w:r>
           </w:p>
@@ -14507,6 +15611,7 @@
                 <w:szCs w:val="28"/>
                 <w:lang w:val="it-IT"/>
               </w:rPr>
+              <w:lastRenderedPageBreak/>
               <w:t>TS 2.2.11.4</w:t>
             </w:r>
           </w:p>
@@ -15249,7 +16354,6 @@
                 <w:szCs w:val="28"/>
                 <w:lang w:val="it-IT"/>
               </w:rPr>
-              <w:lastRenderedPageBreak/>
               <w:t>TS 2.2.11.6</w:t>
             </w:r>
           </w:p>

</xml_diff>